<commit_message>
feat(routing): planning d'équipe, une ligne par personne et un jour par colonne
- Admin › Routing & Planning › Tournées planifiées s'ouvre sur le planning
  d'équipe : semaine du lundi au samedi (dimanche s'il porte une tournée),
  PDV faits / prévus, « à générer », SSF du jour pour Atom, totaux par jour ;
  un clic ouvre la popup « Tournée du jour ». Filtres Tous / Atom /
  Friesland et recherche ; « Par personne » garde les cartes actuelles, choix
  mémorisé dans le navigateur.
- État d'un jour (etatJourTournee) et semaines (lundiDe, decalerSemaine,
  joursSemaine) partagés avec le calendrier par personne ; couleurs dans
  composables/classesEtatTournee.ts (Tailwind ne lit pas utils/).
- fetchRoutings : option limite ; cache utilisateurs : employeur.
- Guide admin mis à jour (PDF, Markdown, Word).

Co-Authored-By: Claude Opus 5.5 <noreply@anthropic.com>
</commit_message>
<xml_diff>
--- a/docs/GUIDE-ADMINISTRATION.docx
+++ b/docs/GUIDE-ADMINISTRATION.docx
@@ -3865,6 +3865,18 @@
         <w:rPr>
           <w:b/>
         </w:rPr>
+        <w:t>Planning d'équipe</w:t>
+      </w:r>
+      <w:r>
+        <w:rPr/>
+        <w:t xml:space="preserve"> : Routing &amp; Planning › Tournées planifiées s'ouvre sur une grille personne × jour (lundi → samedi) : PDV faits / prévus, « à générer », SSF du jour pour Atom ; un clic ouvre la tournée du jour. « Par personne » revient aux cartes individuelles (liste et calendrier du mois).</w:t>
+      </w:r>
+    </w:p>
+    <w:p>
+      <w:r>
+        <w:rPr>
+          <w:b/>
+        </w:rPr>
         <w:t>Objectif mensuel</w:t>
       </w:r>
       <w:r>

</xml_diff>

<commit_message>
docs: accès admin (URL, identifiant) dans le guide, fiche admin personnelle hors dépôt
- Guide admin (md, html, PDF, docx) : adresse https://frieslandv3.vercel.app/login
  et compte admin@friesland.ci ; le mot de passe est remis séparément et
  n'apparaît dans aucun fichier versionné (dépôt public).
- generer-guides-pdf.mjs --admin <email> : guide admin avec fiche de connexion
  (mot de passe lu dans GUIDE_ADMIN_MOT_DE_PASSE) dans docs/guides/utilisateurs/admin/,
  dossier non versionné.

Co-Authored-By: Claude Opus 5.5 <noreply@anthropic.com>
</commit_message>
<xml_diff>
--- a/docs/GUIDE-ADMINISTRATION.docx
+++ b/docs/GUIDE-ADMINISTRATION.docx
@@ -19,7 +19,7 @@
         <w:rPr>
           <w:i/>
         </w:rPr>
-        <w:t>Version du 6 octobre 2026 (application mobile 1.0.12). Couvre le back-office web (</w:t>
+        <w:t>Version du 8 octobre 2026 (application mobile 1.0.12). Couvre le back-office web (</w:t>
       </w:r>
       <w:r>
         <w:rPr>
@@ -78,22 +78,42 @@
         <w:rPr>
           <w:b/>
         </w:rPr>
-        <w:t>URL</w:t>
-      </w:r>
+        <w:t>URL de connexion</w:t>
+      </w:r>
+      <w:r>
+        <w:t xml:space="preserve"> : https://frieslandv3.vercel.app/login</w:t>
+      </w:r>
+    </w:p>
+    <w:p>
+      <w:pPr>
+        <w:pStyle w:val="ListBullet"/>
+      </w:pPr>
+      <w:r>
+        <w:rPr>
+          <w:b/>
+        </w:rPr>
+        <w:t>Compte administrateur</w:t>
+      </w:r>
+      <w:r>
+        <w:t xml:space="preserve"> : </w:t>
+      </w:r>
+      <w:r>
+        <w:rPr>
+          <w:rFonts w:ascii="Menlo" w:hAnsi="Menlo"/>
+        </w:rPr>
+        <w:t>admin@friesland.ci</w:t>
+      </w:r>
+      <w:r>
+        <w:t>. Le mot de passe est remis séparément, en main propre ; il ne figure jamais dans ce guide.</w:t>
+      </w:r>
+    </w:p>
+    <w:p>
+      <w:pPr>
+        <w:pStyle w:val="ListBullet"/>
+      </w:pPr>
       <w:r>
         <w:rPr/>
-        <w:t xml:space="preserve"> : l'application web, page </w:t>
-      </w:r>
-      <w:r>
-        <w:rPr>
-          <w:rFonts w:ascii="Menlo" w:hAnsi="Menlo" w:eastAsia="Menlo"/>
-          <w:sz w:val="18"/>
-        </w:rPr>
-        <w:t>/login</w:t>
-      </w:r>
-      <w:r>
-        <w:rPr/>
-        <w:t xml:space="preserve">. Après connexion, un </w:t>
+        <w:t xml:space="preserve">Après connexion, un </w:t>
       </w:r>
       <w:r>
         <w:rPr>

</xml_diff>